<commit_message>
Cover letter: add explicit contribution statement
Co-Authored-By: Claude Opus 5.5 <noreply@anthropic.com>
Claude-Session: https://claude.ai/code/session_01BZjJPdbxvnVxMrcgFoYMCh
</commit_message>
<xml_diff>
--- a/agent_hawkes/isr/ISR_Cover_Letter.docx
+++ b/agent_hawkes/isr/ISR_Cover_Letter.docx
@@ -72,10 +72,84 @@
     <w:p>
       <w:r>
         <w:rPr>
+          <w:b/>
+          <w:i w:val="0"/>
+        </w:rPr>
+        <w:t>Contribution statement</w:t>
+      </w:r>
+    </w:p>
+    <w:p>
+      <w:r>
+        <w:rPr>
           <w:b w:val="0"/>
           <w:i w:val="0"/>
         </w:rPr>
-        <w:t>I believe the manuscript fits Information Systems Research for three reasons. First, it extends research on human–AI delegation, including work published in the journal, from the decision to delegate to the decision to revoke a delegation, which becomes central once agents act over many steps. Second, it links the choice of what to monitor to IS research on control and to the economics of information, and it connects agent oversight to the field's long-standing concern with information quality: capable agents act on what their tools tell them, so the accuracy of enterprise data becomes part of AI governance. Third, it offers managers design rules that can be implemented with existing escalation mechanisms and calibrated with a small experiment on their own tasks.</w:t>
+        <w:t>The manuscript makes four contributions.</w:t>
+      </w:r>
+    </w:p>
+    <w:p>
+      <w:pPr>
+        <w:ind w:left="432"/>
+      </w:pPr>
+      <w:r>
+        <w:rPr>
+          <w:b/>
+        </w:rPr>
+        <w:t xml:space="preserve">(1) Theoretical contribution. </w:t>
+      </w:r>
+      <w:r>
+        <w:t>It formalizes the revocation of a delegation to an autonomous AI agent as an optimal stopping problem and characterizes the optimal hand-off rule under three distinct error mechanisms: contagion, task heterogeneity, and derailment. It shows that the statistic a monitoring system should track differs across mechanisms (a recency-weighted intensity, an error rate, or a weighted error count), derives the optimal threshold in closed form under derailment, and proves that the value of monitoring is greatest for tasks at the margin of delegation.</w:t>
+      </w:r>
+    </w:p>
+    <w:p>
+      <w:pPr>
+        <w:ind w:left="432"/>
+      </w:pPr>
+      <w:r>
+        <w:rPr>
+          <w:b/>
+        </w:rPr>
+        <w:t xml:space="preserve">(2) Empirical contribution. </w:t>
+      </w:r>
+      <w:r>
+        <w:t>It provides causal evidence on how errors affect autonomous agents. Randomized fault injection in two task domains, with five agents and 11,352 runs, separates contagion from persistence and shows that the damage done by an error depends on what the error says: transient failures rarely harm recent models, whereas errors that misreport the state of the environment lower task success by up to 30 percentage points. A large observational corpus further shows that ignoring task heterogeneity overstates contagion by a factor of three to four.</w:t>
+      </w:r>
+    </w:p>
+    <w:p>
+      <w:pPr>
+        <w:ind w:left="432"/>
+      </w:pPr>
+      <w:r>
+        <w:rPr>
+          <w:b/>
+        </w:rPr>
+        <w:t xml:space="preserve">(3) Methodological contribution. </w:t>
+      </w:r>
+      <w:r>
+        <w:t>It introduces a design that firms and researchers can use to measure the parameters that govern oversight: a random-effects self-exciting model that separates heterogeneity from contagion in agent logs, and a low-cost fault-injection protocol that estimates the probability that each kind of error derails a task. All code and run-level data are provided in a replication package.</w:t>
+      </w:r>
+    </w:p>
+    <w:p>
+      <w:pPr>
+        <w:ind w:left="432"/>
+      </w:pPr>
+      <w:r>
+        <w:rPr>
+          <w:b/>
+        </w:rPr>
+        <w:t xml:space="preserve">(4) Practical contribution. </w:t>
+      </w:r>
+      <w:r>
+        <w:t>It gives managers implementable design rules: count agent errors by type rather than in total, calibrate the hand-off threshold for each task domain, and target monitoring investment at tasks near the margin of delegation. It also shows that the accuracy of the data agents read is a determinant of agent performance, which makes data governance part of AI governance.</w:t>
+      </w:r>
+    </w:p>
+    <w:p>
+      <w:r>
+        <w:rPr>
+          <w:b w:val="0"/>
+          <w:i w:val="0"/>
+        </w:rPr>
+        <w:t>These contributions speak directly to three conversations in Information Systems Research: human–AI delegation, which the paper extends from the decision to delegate to the decision to revoke a delegation; IS control, which it connects to the economics of information; and information quality, which it links to the governance of agentic AI.</w:t>
       </w:r>
     </w:p>
     <w:p>
@@ -122,7 +196,7 @@
     </w:p>
     <w:sectPr>
       <w:pgSz w:w="12240" w:h="15840"/>
-      <w:pgMar w:top="1440" w:right="1440" w:bottom="1440" w:left="1440" w:header="720" w:footer="720" w:gutter="0"/>
+      <w:pgMar w:top="1152" w:right="1440" w:bottom="1152" w:left="1440" w:header="720" w:footer="720" w:gutter="0"/>
       <w:cols w:space="720"/>
       <w:docGrid w:linePitch="360"/>
     </w:sectPr>
@@ -494,7 +568,7 @@
     <w:qFormat/>
     <w:rsid w:val="00FC693F"/>
     <w:pPr>
-      <w:spacing w:after="200" w:line="276" w:lineRule="auto"/>
+      <w:spacing w:after="120" w:line="240" w:lineRule="auto"/>
     </w:pPr>
     <w:rPr>
       <w:rFonts w:ascii="Times New Roman" w:hAnsi="Times New Roman" w:eastAsia="Times New Roman"/>

</xml_diff>